<commit_message>
feat: open self-service business signup with agreement + billing gates
New /signup route lets anyone create their own business owner account
without admin approval. First login shows the bilingual partnership
agreement (mechanically extracted from the source .docx, never
retyped); accepting it unlocks the portal. A minimal trade-name + CR
number form gates paid-plan selection, with the rest of the billing
fields kept in the schema behind an admin show/hide toggle for later.

While packages stay admin-disabled, every business gets full
Premium-tier entitlements (menu, featured placement, analytics,
unlimited branches/photos, social links) at no cost, and all
package/plan wording is hidden from owners; re-enabling packages
restores real tier differences exactly as before.

Co-Authored-By: Claude Sonnet 5 <noreply@anthropic.com>
</commit_message>
<xml_diff>
--- a/legal-source/partnership-agreement-source.docx
+++ b/legal-source/partnership-agreement-source.docx
@@ -260,39 +260,39 @@
                 <w:szCs w:val="23"/>
                 <w:u w:val="single"/>
               </w:rPr>
-              <w:t xml:space="preserve">Parties and Date</w:t>
-            </w:r>
-          </w:p>
-          <w:p>
-            <w:pPr>
-              <w:spacing w:after="100"/>
-              <w:jc w:val="left"/>
-            </w:pPr>
-            <w:r>
-              <w:rPr>
-                <w:rFonts w:ascii="Calibri" w:cs="Calibri" w:eastAsia="Calibri" w:hAnsi="Calibri"/>
-                <w:b w:val="false"/>
-                <w:bCs w:val="false"/>
-                <w:sz w:val="21"/>
-                <w:szCs w:val="21"/>
-              </w:rPr>
-              <w:t xml:space="preserve">On this day corresponding to ___ /___ /___ H, an agreement was concluded between:</w:t>
-            </w:r>
-          </w:p>
-          <w:p>
-            <w:pPr>
-              <w:spacing w:after="100"/>
-              <w:jc w:val="left"/>
-            </w:pPr>
-            <w:r>
-              <w:rPr>
-                <w:rFonts w:ascii="Calibri" w:cs="Calibri" w:eastAsia="Calibri" w:hAnsi="Calibri"/>
-                <w:b w:val="false"/>
-                <w:bCs w:val="false"/>
-                <w:sz w:val="21"/>
-                <w:szCs w:val="21"/>
-              </w:rPr>
-              <w:t xml:space="preserve">First: Pure Table Platform ("Pure Table"), Commercial Registration No.: 7055126135, Tax Number: Not registered, Address: Riyadh, Kingdom of Saudi Arabia, Email: info@puretable.co, represented by/in the capacity of: Renad Alharbi – Owner of the Establishment.</w:t>
+              <w:t xml:space="preserve">Parties</w:t>
+            </w:r>
+          </w:p>
+          <w:p>
+            <w:pPr>
+              <w:spacing w:after="100"/>
+              <w:jc w:val="left"/>
+            </w:pPr>
+            <w:r>
+              <w:rPr>
+                <w:rFonts w:ascii="Calibri" w:cs="Calibri" w:eastAsia="Calibri" w:hAnsi="Calibri"/>
+                <w:b w:val="false"/>
+                <w:bCs w:val="false"/>
+                <w:sz w:val="21"/>
+                <w:szCs w:val="21"/>
+              </w:rPr>
+              <w:t xml:space="preserve">An agreement was concluded between:</w:t>
+            </w:r>
+          </w:p>
+          <w:p>
+            <w:pPr>
+              <w:spacing w:after="100"/>
+              <w:jc w:val="left"/>
+            </w:pPr>
+            <w:r>
+              <w:rPr>
+                <w:rFonts w:ascii="Calibri" w:cs="Calibri" w:eastAsia="Calibri" w:hAnsi="Calibri"/>
+                <w:b w:val="false"/>
+                <w:bCs w:val="false"/>
+                <w:sz w:val="21"/>
+                <w:szCs w:val="21"/>
+              </w:rPr>
+              <w:t xml:space="preserve">First: Pure Table Platform ("Pure Table"), Commercial Registration No.: 7055126135, Tax Number: Not registered, Address: Riyadh, Kingdom of Saudi Arabia, Email: info@puretable.co.</w:t>
             </w:r>
           </w:p>
           <w:p>
@@ -324,7 +324,7 @@
                 <w:sz w:val="21"/>
                 <w:szCs w:val="21"/>
               </w:rPr>
-              <w:t xml:space="preserve">Second: (_____), Commercial Registration No.: (_____), Tax Number: (_____), Address: (_____), Email: (_____), represented by/in the capacity of: (_____).</w:t>
+              <w:t xml:space="preserve">Second: (_____), Commercial Registration No.: (_____), Tax Number: (_____), Address: (_____), Email: (_____).</w:t>
             </w:r>
           </w:p>
           <w:p>
@@ -376,43 +376,43 @@
                 <w:u w:val="single"/>
                 <w:rtl/>
               </w:rPr>
-              <w:t xml:space="preserve">أطراف الاتفاقية وتاريخها</w:t>
-            </w:r>
-          </w:p>
-          <w:p>
-            <w:pPr>
-              <w:bidi/>
-              <w:spacing w:after="100"/>
-              <w:jc w:val="right"/>
-            </w:pPr>
-            <w:r>
-              <w:rPr>
-                <w:rFonts w:ascii="Sakkal Majalla" w:cs="Sakkal Majalla" w:eastAsia="Sakkal Majalla" w:hAnsi="Sakkal Majalla"/>
-                <w:b w:val="false"/>
-                <w:bCs w:val="false"/>
-                <w:sz w:val="21"/>
-                <w:szCs w:val="21"/>
-                <w:rtl/>
-              </w:rPr>
-              <w:t xml:space="preserve">إنه في يوم الموافق / /هـ تم الاتفاق بين كل من:</w:t>
-            </w:r>
-          </w:p>
-          <w:p>
-            <w:pPr>
-              <w:bidi/>
-              <w:spacing w:after="100"/>
-              <w:jc w:val="right"/>
-            </w:pPr>
-            <w:r>
-              <w:rPr>
-                <w:rFonts w:ascii="Sakkal Majalla" w:cs="Sakkal Majalla" w:eastAsia="Sakkal Majalla" w:hAnsi="Sakkal Majalla"/>
-                <w:b w:val="false"/>
-                <w:bCs w:val="false"/>
-                <w:sz w:val="21"/>
-                <w:szCs w:val="21"/>
-                <w:rtl/>
-              </w:rPr>
-              <w:t xml:space="preserve">أولاً: منصة Pure Table – بيور تيبل، السجل التجاري: 7055126135 الرقم الضريبي: غير مسجلة العنوان: الرياض، المملكة العربية السعودية البريد الإلكتروني: info@puretable.co ويمثلها/ بصفته: ريناد الحربي – صاحبة المؤسسة.</w:t>
+              <w:t xml:space="preserve">أطراف الاتفاقية</w:t>
+            </w:r>
+          </w:p>
+          <w:p>
+            <w:pPr>
+              <w:bidi/>
+              <w:spacing w:after="100"/>
+              <w:jc w:val="right"/>
+            </w:pPr>
+            <w:r>
+              <w:rPr>
+                <w:rFonts w:ascii="Sakkal Majalla" w:cs="Sakkal Majalla" w:eastAsia="Sakkal Majalla" w:hAnsi="Sakkal Majalla"/>
+                <w:b w:val="false"/>
+                <w:bCs w:val="false"/>
+                <w:sz w:val="21"/>
+                <w:szCs w:val="21"/>
+                <w:rtl/>
+              </w:rPr>
+              <w:t xml:space="preserve">تم الاتفاق بين كل من:</w:t>
+            </w:r>
+          </w:p>
+          <w:p>
+            <w:pPr>
+              <w:bidi/>
+              <w:spacing w:after="100"/>
+              <w:jc w:val="right"/>
+            </w:pPr>
+            <w:r>
+              <w:rPr>
+                <w:rFonts w:ascii="Sakkal Majalla" w:cs="Sakkal Majalla" w:eastAsia="Sakkal Majalla" w:hAnsi="Sakkal Majalla"/>
+                <w:b w:val="false"/>
+                <w:bCs w:val="false"/>
+                <w:sz w:val="21"/>
+                <w:szCs w:val="21"/>
+                <w:rtl/>
+              </w:rPr>
+              <w:t xml:space="preserve">أولاً: منصة Pure Table – بيور تيبل، السجل التجاري: 7055126135 الرقم الضريبي: غير مسجلة العنوان: الرياض، المملكة العربية السعودية البريد الإلكتروني: info@puretable.co.</w:t>
             </w:r>
           </w:p>
           <w:p>
@@ -448,7 +448,7 @@
                 <w:szCs w:val="21"/>
                 <w:rtl/>
               </w:rPr>
-              <w:t xml:space="preserve">ثانياً: ()، السجل التجاري: () الرقم الضريبي: () العنوان: () البريد الإلكتروني: () ويمثلها/ بصفته ().</w:t>
+              <w:t xml:space="preserve">ثانياً: ()، السجل التجاري: () الرقم الضريبي: () العنوان: () البريد الإلكتروني: ().</w:t>
             </w:r>
           </w:p>
           <w:p>
@@ -1270,23 +1270,23 @@
                 <w:sz w:val="21"/>
                 <w:szCs w:val="21"/>
               </w:rPr>
-              <w:t xml:space="preserve">Under this Agreement, the First Party enables the Second Party to subscribe to the Pure Table Platform and to list the Establishment, its data, items, and food options in accordance with the chosen Package, with the aim of promoting the Establishment and enabling Platform users to discover it and access the communication, ordering, or booking channels provided by the Establishment.</w:t>
-            </w:r>
-          </w:p>
-          <w:p>
-            <w:pPr>
-              <w:spacing w:after="100"/>
-              <w:jc w:val="left"/>
-            </w:pPr>
-            <w:r>
-              <w:rPr>
-                <w:rFonts w:ascii="Calibri" w:cs="Calibri" w:eastAsia="Calibri" w:hAnsi="Calibri"/>
-                <w:b w:val="false"/>
-                <w:bCs w:val="false"/>
-                <w:sz w:val="21"/>
-                <w:szCs w:val="21"/>
-              </w:rPr>
-              <w:t xml:space="preserve">The First Party's services, depending on the chosen Package and what is available on the Platform, include:</w:t>
+              <w:t xml:space="preserve">Under this Agreement, the First Party enables the Second Party to subscribe to the Pure Table Platform and to list the Establishment, its data, items, and food options, with the aim of promoting the Establishment and enabling Platform users to discover it and access the communication, ordering, or booking channels provided by the Establishment.</w:t>
+            </w:r>
+          </w:p>
+          <w:p>
+            <w:pPr>
+              <w:spacing w:after="100"/>
+              <w:jc w:val="left"/>
+            </w:pPr>
+            <w:r>
+              <w:rPr>
+                <w:rFonts w:ascii="Calibri" w:cs="Calibri" w:eastAsia="Calibri" w:hAnsi="Calibri"/>
+                <w:b w:val="false"/>
+                <w:bCs w:val="false"/>
+                <w:sz w:val="21"/>
+                <w:szCs w:val="21"/>
+              </w:rPr>
+              <w:t xml:space="preserve">The First Party's services include:</w:t>
             </w:r>
           </w:p>
           <w:p>
@@ -1516,25 +1516,25 @@
                 <w:szCs w:val="21"/>
                 <w:rtl/>
               </w:rPr>
-              <w:t xml:space="preserve">بموجب هذه الاتفاقية، يتيح الطرف الأول للطرف الثاني الاشتراك في منصة Pure Table وإدراج المنشأة وبياناتها وأصنافها وخياراتها الغذائية وفق الباقة المختارة، وذلك بهدف التعريف بالمنشأة وتمكين مستخدمي المنصة من اكتشافها والوصول إلى قنوات التواصل أو الطلب أو الحجز التي توفرها المنشأة.</w:t>
-            </w:r>
-          </w:p>
-          <w:p>
-            <w:pPr>
-              <w:bidi/>
-              <w:spacing w:after="100"/>
-              <w:jc w:val="right"/>
-            </w:pPr>
-            <w:r>
-              <w:rPr>
-                <w:rFonts w:ascii="Sakkal Majalla" w:cs="Sakkal Majalla" w:eastAsia="Sakkal Majalla" w:hAnsi="Sakkal Majalla"/>
-                <w:b w:val="false"/>
-                <w:bCs w:val="false"/>
-                <w:sz w:val="21"/>
-                <w:szCs w:val="21"/>
-                <w:rtl/>
-              </w:rPr>
-              <w:t xml:space="preserve">وتشمل خدمات الطرف الأول، بحسب الباقة المختارة وما هو متاح في المنصة:</w:t>
+              <w:t xml:space="preserve">بموجب هذه الاتفاقية، يتيح الطرف الأول للطرف الثاني الاشتراك في منصة Pure Table وإدراج المنشأة وبياناتها وأصنافها وخياراتها الغذائية، وذلك بهدف التعريف بالمنشأة وتمكين مستخدمي المنصة من اكتشافها والوصول إلى قنوات التواصل أو الطلب أو الحجز التي توفرها المنشأة.</w:t>
+            </w:r>
+          </w:p>
+          <w:p>
+            <w:pPr>
+              <w:bidi/>
+              <w:spacing w:after="100"/>
+              <w:jc w:val="right"/>
+            </w:pPr>
+            <w:r>
+              <w:rPr>
+                <w:rFonts w:ascii="Sakkal Majalla" w:cs="Sakkal Majalla" w:eastAsia="Sakkal Majalla" w:hAnsi="Sakkal Majalla"/>
+                <w:b w:val="false"/>
+                <w:bCs w:val="false"/>
+                <w:sz w:val="21"/>
+                <w:szCs w:val="21"/>
+                <w:rtl/>
+              </w:rPr>
+              <w:t xml:space="preserve">وتشمل خدمات الطرف الأول:</w:t>
             </w:r>
           </w:p>
           <w:p>
@@ -1994,6 +1994,22 @@
                 <w:sz w:val="21"/>
                 <w:szCs w:val="21"/>
               </w:rPr>
+              <w:t xml:space="preserve">No fees or paid subscriptions are currently in effect, and all Packages are presently offered free of charge. The First Party reserves the right to activate paid fees in the future, provided that the Establishment is notified in writing at least thirty (30) days in advance, and the Establishment shall have the full right to continue or to withdraw without any obligation.</w:t>
+            </w:r>
+          </w:p>
+          <w:p>
+            <w:pPr>
+              <w:spacing w:after="100"/>
+              <w:jc w:val="left"/>
+            </w:pPr>
+            <w:r>
+              <w:rPr>
+                <w:rFonts w:ascii="Calibri" w:cs="Calibri" w:eastAsia="Calibri" w:hAnsi="Calibri"/>
+                <w:b w:val="false"/>
+                <w:bCs w:val="false"/>
+                <w:sz w:val="21"/>
+                <w:szCs w:val="21"/>
+              </w:rPr>
               <w:t xml:space="preserve">Establishments may choose from the Packages approved by Pure Table in accordance with the prices and benefits published or agreed upon at the time of subscription, including the following:</w:t>
             </w:r>
           </w:p>
@@ -2581,6 +2597,22 @@
                 <w:szCs w:val="21"/>
               </w:rPr>
               <w:t xml:space="preserve">The approved price for the Premium Package: SAR 299 per month, exclusive of value-added tax where applicable.</w:t>
+            </w:r>
+          </w:p>
+          <w:p>
+            <w:pPr>
+              <w:spacing w:after="100"/>
+              <w:jc w:val="left"/>
+            </w:pPr>
+            <w:r>
+              <w:rPr>
+                <w:rFonts w:ascii="Calibri" w:cs="Calibri" w:eastAsia="Calibri" w:hAnsi="Calibri"/>
+                <w:b w:val="false"/>
+                <w:bCs w:val="false"/>
+                <w:sz w:val="21"/>
+                <w:szCs w:val="21"/>
+              </w:rPr>
+              <w:t xml:space="preserve">As with the other Packages, the fee described below for this Package is not currently activated and shall apply only once paid Subscriptions are activated in accordance with the disclosure set out at the beginning of this clause.</w:t>
             </w:r>
           </w:p>
           <w:p>
@@ -2666,6 +2698,24 @@
                 <w:szCs w:val="21"/>
                 <w:rtl/>
               </w:rPr>
+              <w:t xml:space="preserve">لا توجد حالياً أي رسوم أو اشتراكات مدفوعة، وتُقدَّم جميع الباقات في الوقت الراهن مجاناً بالكامل، ويحتفظ الطرف الأول بالحق في تفعيل رسوم مدفوعة مستقبلاً، على أن يتم إشعار المنشأة كتابياً بذلك قبل ثلاثين (30) يوماً على الأقل، ويكون للمنشأة كامل الحق في الاستمرار أو الانسحاب دون أي التزام.</w:t>
+            </w:r>
+          </w:p>
+          <w:p>
+            <w:pPr>
+              <w:bidi/>
+              <w:spacing w:after="100"/>
+              <w:jc w:val="right"/>
+            </w:pPr>
+            <w:r>
+              <w:rPr>
+                <w:rFonts w:ascii="Sakkal Majalla" w:cs="Sakkal Majalla" w:eastAsia="Sakkal Majalla" w:hAnsi="Sakkal Majalla"/>
+                <w:b w:val="false"/>
+                <w:bCs w:val="false"/>
+                <w:sz w:val="21"/>
+                <w:szCs w:val="21"/>
+                <w:rtl/>
+              </w:rPr>
               <w:t xml:space="preserve">تتوفر للمنشآت الباقات المعتمدة من Pure Table وفق الأسعار والمزايا المنشورة أو المتفق عليها وقت الاشتراك، ومن ذلك ما يلي:</w:t>
             </w:r>
           </w:p>
@@ -3309,6 +3359,24 @@
                 <w:rtl/>
               </w:rPr>
               <w:t xml:space="preserve">السعر المعتمد لباقة Premium: 299 ريال شهرياً، غير شامل ضريبة القيمة المضافة عند انطباقها.</w:t>
+            </w:r>
+          </w:p>
+          <w:p>
+            <w:pPr>
+              <w:bidi/>
+              <w:spacing w:after="100"/>
+              <w:jc w:val="right"/>
+            </w:pPr>
+            <w:r>
+              <w:rPr>
+                <w:rFonts w:ascii="Sakkal Majalla" w:cs="Sakkal Majalla" w:eastAsia="Sakkal Majalla" w:hAnsi="Sakkal Majalla"/>
+                <w:b w:val="false"/>
+                <w:bCs w:val="false"/>
+                <w:sz w:val="21"/>
+                <w:szCs w:val="21"/>
+                <w:rtl/>
+              </w:rPr>
+              <w:t xml:space="preserve">كما هو الحال في باقي الباقات، فإن الرسوم الموضحة أدناه لهذه الباقة غير مفعّلة حالياً وتسري فقط عند تفعيل الاشتراكات المدفوعة وفقاً للإفصاح الوارد في بداية هذا البند.</w:t>
             </w:r>
           </w:p>
           <w:p>
@@ -3396,89 +3464,7 @@
                 <w:sz w:val="21"/>
                 <w:szCs w:val="21"/>
               </w:rPr>
-              <w:t xml:space="preserve">The First Party grants the first ten (10) establishments approved and contracted under the Pure Table launch program the status of "Founding Partner." A Founding Partner receives the Pro Package free of charge for a period of sixty (60) days, commencing from the date the Establishment's account is activated on the Platform. The sixty (60)-day free period does not include any services or expenses outside the scope of the Pro Package's benefits, unless the Parties agree otherwise in writing. Upon expiry of the sixty (60)-day free period, the free benefit automatically ends, and the Establishment shall have the option to:</w:t>
-            </w:r>
-          </w:p>
-          <w:p>
-            <w:pPr>
-              <w:pStyle w:val="ListParagraph"/>
-              <w:numPr>
-                <w:ilvl w:val="0"/>
-                <w:numId w:val="1"/>
-              </w:numPr>
-              <w:spacing w:after="100"/>
-              <w:ind w:left="260" w:hanging="180"/>
-              <w:jc w:val="left"/>
-            </w:pPr>
-            <w:r>
-              <w:rPr>
-                <w:rFonts w:ascii="Calibri" w:cs="Calibri" w:eastAsia="Calibri" w:hAnsi="Calibri"/>
-                <w:b w:val="false"/>
-                <w:bCs w:val="false"/>
-                <w:sz w:val="21"/>
-                <w:szCs w:val="21"/>
-              </w:rPr>
-              <w:t xml:space="preserve">Subscribe to the Pro, Premium, or any other available Package; or</w:t>
-            </w:r>
-          </w:p>
-          <w:p>
-            <w:pPr>
-              <w:pStyle w:val="ListParagraph"/>
-              <w:numPr>
-                <w:ilvl w:val="0"/>
-                <w:numId w:val="1"/>
-              </w:numPr>
-              <w:spacing w:after="100"/>
-              <w:ind w:left="260" w:hanging="180"/>
-              <w:jc w:val="left"/>
-            </w:pPr>
-            <w:r>
-              <w:rPr>
-                <w:rFonts w:ascii="Calibri" w:cs="Calibri" w:eastAsia="Calibri" w:hAnsi="Calibri"/>
-                <w:b w:val="false"/>
-                <w:bCs w:val="false"/>
-                <w:sz w:val="21"/>
-                <w:szCs w:val="21"/>
-              </w:rPr>
-              <w:t xml:space="preserve">Move to the Free Package, if available; or</w:t>
-            </w:r>
-          </w:p>
-          <w:p>
-            <w:pPr>
-              <w:pStyle w:val="ListParagraph"/>
-              <w:numPr>
-                <w:ilvl w:val="0"/>
-                <w:numId w:val="1"/>
-              </w:numPr>
-              <w:spacing w:after="100"/>
-              <w:ind w:left="260" w:hanging="180"/>
-              <w:jc w:val="left"/>
-            </w:pPr>
-            <w:r>
-              <w:rPr>
-                <w:rFonts w:ascii="Calibri" w:cs="Calibri" w:eastAsia="Calibri" w:hAnsi="Calibri"/>
-                <w:b w:val="false"/>
-                <w:bCs w:val="false"/>
-                <w:sz w:val="21"/>
-                <w:szCs w:val="21"/>
-              </w:rPr>
-              <w:t xml:space="preserve">Request termination of the Subscription and removal of the page in accordance with the provisions of this Agreement.</w:t>
-            </w:r>
-          </w:p>
-          <w:p>
-            <w:pPr>
-              <w:spacing w:after="100"/>
-              <w:jc w:val="left"/>
-            </w:pPr>
-            <w:r>
-              <w:rPr>
-                <w:rFonts w:ascii="Calibri" w:cs="Calibri" w:eastAsia="Calibri" w:hAnsi="Calibri"/>
-                <w:b w:val="false"/>
-                <w:bCs w:val="false"/>
-                <w:sz w:val="21"/>
-                <w:szCs w:val="21"/>
-              </w:rPr>
-              <w:t xml:space="preserve">The expiry of the free period shall not result in an automatic paid renewal unless the Establishment expressly agrees to the paid subscription in accordance with the approved subscription mechanism.</w:t>
+              <w:t xml:space="preserve">The First Party grants the first ten (10) establishments approved and contracted under the Pure Table launch program permanent "Founding Partner" status. This status may include preferential benefits determined by the Platform upon activation of any future paid packages or subscriptions, without creating any specific obligation to particular benefits unless expressly announced by the Platform.</w:t>
             </w:r>
           </w:p>
         </w:tc>
@@ -3532,97 +3518,7 @@
                 <w:szCs w:val="21"/>
                 <w:rtl/>
               </w:rPr>
-              <w:t xml:space="preserve">يمنح الطرف الأول أول عشر (10) منشآت يتم اعتمادها والتعاقد معها ضمن برنامج إطلاق Pure Table صفة شريك إطلاق Founding Partner، ويحصل شريك الإطلاق على باقة Pro مجانًا لمدة ستين (60) يومًا تبدأ من تاريخ تفعيل حساب المنشأة على المنصة، ولا تشمل فترة الستين يومًا المجانية أي خدمات أو مصروفات خارج نطاق مزايا باقة Pro ما لم يتفق الطرفان كتابةً على خلاف ذلك، وبانتهاء فترة الستين يومًا المجانية، تنتهي الميزة المجانية تلقائيًا، ويكون للمنشأة الخيار في:</w:t>
-            </w:r>
-          </w:p>
-          <w:p>
-            <w:pPr>
-              <w:pStyle w:val="ListParagraph"/>
-              <w:numPr>
-                <w:ilvl w:val="0"/>
-                <w:numId w:val="1"/>
-              </w:numPr>
-              <w:bidi/>
-              <w:spacing w:after="100"/>
-              <w:ind w:right="260" w:hanging="180"/>
-              <w:jc w:val="right"/>
-            </w:pPr>
-            <w:r>
-              <w:rPr>
-                <w:rFonts w:ascii="Sakkal Majalla" w:cs="Sakkal Majalla" w:eastAsia="Sakkal Majalla" w:hAnsi="Sakkal Majalla"/>
-                <w:b w:val="false"/>
-                <w:bCs w:val="false"/>
-                <w:sz w:val="21"/>
-                <w:szCs w:val="21"/>
-                <w:rtl/>
-              </w:rPr>
-              <w:t xml:space="preserve">الاشتراك في باقة Pro أو Premium أو أي باقة أخرى متاحة؛ أو</w:t>
-            </w:r>
-          </w:p>
-          <w:p>
-            <w:pPr>
-              <w:pStyle w:val="ListParagraph"/>
-              <w:numPr>
-                <w:ilvl w:val="0"/>
-                <w:numId w:val="1"/>
-              </w:numPr>
-              <w:bidi/>
-              <w:spacing w:after="100"/>
-              <w:ind w:right="260" w:hanging="180"/>
-              <w:jc w:val="right"/>
-            </w:pPr>
-            <w:r>
-              <w:rPr>
-                <w:rFonts w:ascii="Sakkal Majalla" w:cs="Sakkal Majalla" w:eastAsia="Sakkal Majalla" w:hAnsi="Sakkal Majalla"/>
-                <w:b w:val="false"/>
-                <w:bCs w:val="false"/>
-                <w:sz w:val="21"/>
-                <w:szCs w:val="21"/>
-                <w:rtl/>
-              </w:rPr>
-              <w:t xml:space="preserve">الانتقال إلى الباقة المجانية Free إذا كانت متاحة؛ أو</w:t>
-            </w:r>
-          </w:p>
-          <w:p>
-            <w:pPr>
-              <w:pStyle w:val="ListParagraph"/>
-              <w:numPr>
-                <w:ilvl w:val="0"/>
-                <w:numId w:val="1"/>
-              </w:numPr>
-              <w:bidi/>
-              <w:spacing w:after="100"/>
-              <w:ind w:right="260" w:hanging="180"/>
-              <w:jc w:val="right"/>
-            </w:pPr>
-            <w:r>
-              <w:rPr>
-                <w:rFonts w:ascii="Sakkal Majalla" w:cs="Sakkal Majalla" w:eastAsia="Sakkal Majalla" w:hAnsi="Sakkal Majalla"/>
-                <w:b w:val="false"/>
-                <w:bCs w:val="false"/>
-                <w:sz w:val="21"/>
-                <w:szCs w:val="21"/>
-                <w:rtl/>
-              </w:rPr>
-              <w:t xml:space="preserve">طلب إنهاء الاشتراك وإزالة الصفحة وفق أحكام هذه الاتفاقية.</w:t>
-            </w:r>
-          </w:p>
-          <w:p>
-            <w:pPr>
-              <w:bidi/>
-              <w:spacing w:after="100"/>
-              <w:jc w:val="right"/>
-            </w:pPr>
-            <w:r>
-              <w:rPr>
-                <w:rFonts w:ascii="Sakkal Majalla" w:cs="Sakkal Majalla" w:eastAsia="Sakkal Majalla" w:hAnsi="Sakkal Majalla"/>
-                <w:b w:val="false"/>
-                <w:bCs w:val="false"/>
-                <w:sz w:val="21"/>
-                <w:szCs w:val="21"/>
-                <w:rtl/>
-              </w:rPr>
-              <w:t xml:space="preserve">ولا يترتب على انتهاء الفترة المجانية تجديد مدفوع تلقائي ما لم توافق المنشأة صراحة على الاشتراك المدفوع وفق آلية الاشتراك المعتمدة.</w:t>
+              <w:t xml:space="preserve">يمنح الطرف الأول أول عشر (10) منشآت يتم اعتمادها والتعاقد معها ضمن برنامج إطلاق Pure Table صفة "شريك إطلاق" (Founding Partner) بصورة دائمة، وقد تتضمن هذه الصفة مزايا تفضيلية تحددها المنصة عند تفعيل أي باقات أو اشتراكات مدفوعة مستقبلاً، دون أن يترتب على ذلك التزام محدد بمزايا معينة ما لم تعلن المنصة عنها صراحة.</w:t>
             </w:r>
           </w:p>
         </w:tc>
@@ -7378,7 +7274,23 @@
                 <w:sz w:val="21"/>
                 <w:szCs w:val="21"/>
               </w:rPr>
-              <w:t xml:space="preserve">Throughout the term of its paid subscription, the Establishment may, at its discretion, offer one or more Exclusive Benefits to Pure Table users, with no obligation to do so. The benefit may be:</w:t>
+              <w:t xml:space="preserve">This clause applies regardless of whether the Establishment's current Package is free or paid, and remains entirely discretionary with no obligation on the Establishment's part.</w:t>
+            </w:r>
+          </w:p>
+          <w:p>
+            <w:pPr>
+              <w:spacing w:after="100"/>
+              <w:jc w:val="left"/>
+            </w:pPr>
+            <w:r>
+              <w:rPr>
+                <w:rFonts w:ascii="Calibri" w:cs="Calibri" w:eastAsia="Calibri" w:hAnsi="Calibri"/>
+                <w:b w:val="false"/>
+                <w:bCs w:val="false"/>
+                <w:sz w:val="21"/>
+                <w:szCs w:val="21"/>
+              </w:rPr>
+              <w:t xml:space="preserve">The Establishment may, at its discretion, offer one or more Exclusive Benefits to Pure Table users, with no obligation to do so. The benefit may be:</w:t>
             </w:r>
           </w:p>
           <w:p>
@@ -7602,7 +7514,25 @@
                 <w:szCs w:val="21"/>
                 <w:rtl/>
               </w:rPr>
-              <w:t xml:space="preserve">يجوز للمنشأة، طوال مدة اشتراكها المدفوع، أن تقدّم ميزة حصرية واحدة أو أكثر لمستخدمي Pure Table وفق ما تراه مناسبًا، دون إلزام بذلك، ويجوز أن تكون الميزة:</w:t>
+              <w:t xml:space="preserve">ينطبق هذا البند بغض النظر عن كون باقة المنشأة الحالية مجانية أو مدفوعة، ويبقى اختياريًا بالكامل دون أي إلزام على المنشأة.</w:t>
+            </w:r>
+          </w:p>
+          <w:p>
+            <w:pPr>
+              <w:bidi/>
+              <w:spacing w:after="100"/>
+              <w:jc w:val="right"/>
+            </w:pPr>
+            <w:r>
+              <w:rPr>
+                <w:rFonts w:ascii="Sakkal Majalla" w:cs="Sakkal Majalla" w:eastAsia="Sakkal Majalla" w:hAnsi="Sakkal Majalla"/>
+                <w:b w:val="false"/>
+                <w:bCs w:val="false"/>
+                <w:sz w:val="21"/>
+                <w:szCs w:val="21"/>
+                <w:rtl/>
+              </w:rPr>
+              <w:t xml:space="preserve">يجوز للمنشأة، أن تقدّم ميزة حصرية واحدة أو أكثر لمستخدمي Pure Table وفق ما تراه مناسبًا، دون إلزام بذلك، ويجوز أن تكون الميزة:</w:t>
             </w:r>
           </w:p>
           <w:p>
@@ -8256,6 +8186,22 @@
                 <w:sz w:val="21"/>
                 <w:szCs w:val="21"/>
               </w:rPr>
+              <w:t xml:space="preserve">The provisions of this clause are not currently in effect, as no fees or payments are activated at this stage, and shall apply as of the date paid Subscriptions, if any, are activated in the future, as set out in the Packages clause above.</w:t>
+            </w:r>
+          </w:p>
+          <w:p>
+            <w:pPr>
+              <w:spacing w:after="100"/>
+              <w:jc w:val="left"/>
+            </w:pPr>
+            <w:r>
+              <w:rPr>
+                <w:rFonts w:ascii="Calibri" w:cs="Calibri" w:eastAsia="Calibri" w:hAnsi="Calibri"/>
+                <w:b w:val="false"/>
+                <w:bCs w:val="false"/>
+                <w:sz w:val="21"/>
+                <w:szCs w:val="21"/>
+              </w:rPr>
               <w:t xml:space="preserve">The Establishment undertakes to pay the value of the Package it has chosen at the price in effect at the time of subscription. Value-added tax and any other taxes or statutory fees shall be added to the amount due, where applicable. The paid Subscription shall commence from the date payment is confirmed or from the date specified in the subscription form. Payment may be made through the payment methods approved by Pure Table, including electronic payment gateways, bank transfer, or any other method approved by the Platform. Where an external payment provider is used, the processing of payment data shall be governed by the terms and policies of the approved payment provider.</w:t>
             </w:r>
           </w:p>
@@ -8293,6 +8239,24 @@
                 <w:rtl/>
               </w:rPr>
               <w:t xml:space="preserve">الرسوم والاشتراك والسداد</w:t>
+            </w:r>
+          </w:p>
+          <w:p>
+            <w:pPr>
+              <w:bidi/>
+              <w:spacing w:after="100"/>
+              <w:jc w:val="right"/>
+            </w:pPr>
+            <w:r>
+              <w:rPr>
+                <w:rFonts w:ascii="Sakkal Majalla" w:cs="Sakkal Majalla" w:eastAsia="Sakkal Majalla" w:hAnsi="Sakkal Majalla"/>
+                <w:b w:val="false"/>
+                <w:bCs w:val="false"/>
+                <w:sz w:val="21"/>
+                <w:szCs w:val="21"/>
+                <w:rtl/>
+              </w:rPr>
+              <w:t xml:space="preserve">لا تطبق أحكام هذا البند حالياً نظراً لعدم تفعيل أي رسوم أو مدفوعات في المرحلة الراهنة، وتسري اعتباراً من تاريخ تفعيل الاشتراكات المدفوعة، إن وجدت مستقبلاً، وفق ما هو موضح في بند الباقات أعلاه.</w:t>
             </w:r>
           </w:p>
           <w:p>
@@ -8362,7 +8326,7 @@
                 <w:sz w:val="21"/>
                 <w:szCs w:val="21"/>
               </w:rPr>
-              <w:t xml:space="preserve">The Subscription term shall be in accordance with the cycle specified at the time of subscription, whether monthly, annual, or otherwise. The Subscription may renew automatically if the Establishment agrees to automatic renewal and the Platform makes this feature available, at the price in effect at the time of renewal, after notifying the Establishment of any material change in price in accordance with the applicable statutory or contractual period. A Founding Partner's free subscription shall not convert into a paid subscription automatically without the Establishment's consent to the paid subscription.</w:t>
+              <w:t xml:space="preserve">The Subscription term shall be in accordance with the cycle specified at the time of subscription, whether monthly, annual, or otherwise. The Subscription may renew automatically if the Establishment agrees to automatic renewal and the Platform makes this feature available, at the price in effect at the time of renewal, after notifying the Establishment of any material change in price in accordance with the applicable statutory or contractual period.</w:t>
             </w:r>
           </w:p>
         </w:tc>
@@ -8416,7 +8380,7 @@
                 <w:szCs w:val="21"/>
                 <w:rtl/>
               </w:rPr>
-              <w:t xml:space="preserve">تكون مدة الاشتراك وفق الدورة المحددة عند الاشتراك، سواء كانت شهرية أو سنوية أو غير ذلك، ويجوز تجديد الاشتراك تلقائيًا إذا وافقت المنشأة على التجديد التلقائي وأتاحت المنصة هذه الخاصية، وذلك وفق السعر الساري وقت التجديد بعد إشعار المنشأة بأي تغيير جوهري في السعر وفق المدة النظامية أو التعاقدية الواجبة، ولا يتحول الاشتراك المجاني لشريك الإطلاق إلى اشتراك مدفوع تلقائيًا دون موافقة المنشأة على الاشتراك المدفوع.</w:t>
+              <w:t xml:space="preserve">تكون مدة الاشتراك وفق الدورة المحددة عند الاشتراك، سواء كانت شهرية أو سنوية أو غير ذلك، ويجوز تجديد الاشتراك تلقائيًا إذا وافقت المنشأة على التجديد التلقائي وأتاحت المنصة هذه الخاصية، وذلك وفق السعر الساري وقت التجديد بعد إشعار المنشأة بأي تغيير جوهري في السعر وفق المدة النظامية أو التعاقدية الواجبة.</w:t>
             </w:r>
           </w:p>
         </w:tc>

</xml_diff>